<commit_message>
advance: Memo staff-only Internal notes
A staff-only "Internal notes" box (budgets, deals, anything for us only). It
prints on the advance doc in its own shaded row and never renders on the
band's link. Blank and filled docs, one and two artists, still fit one page.

Staging: test_memo 43/43, run_tests 158/158.

Co-Authored-By: Claude Opus 5.5 <noreply@anthropic.com>
</commit_message>
<xml_diff>
--- a/Code/BandInfoForm/tools/doc_templates/Memo Show Advance - 2 Artists.docx
+++ b/Code/BandInfoForm/tools/doc_templates/Memo Show Advance - 2 Artists.docx
@@ -3599,6 +3599,50 @@
                 </w:p>
               </w:tc>
             </w:tr>
+            <w:tr>
+              <w:tc>
+                <w:tcPr>
+                  <w:tcW w:type="dxa" w:w="1656"/>
+                  <w:vAlign w:val="center"/>
+                </w:tcPr>
+                <w:p>
+                  <w:pPr>
+                    <w:spacing w:before="0" w:after="0" w:line="240" w:lineRule="auto"/>
+                    <w:jc w:val="right"/>
+                  </w:pPr>
+                  <w:r>
+                    <w:rPr>
+                      <w:rFonts w:ascii="Avenir Next Condensed" w:hAnsi="Avenir Next Condensed"/>
+                      <w:b/>
+                      <w:i w:val="0"/>
+                      <w:sz w:val="17"/>
+                    </w:rPr>
+                    <w:t>Internal Notes</w:t>
+                  </w:r>
+                </w:p>
+              </w:tc>
+              <w:tc>
+                <w:tcPr>
+                  <w:tcW w:type="dxa" w:w="3024"/>
+                  <w:gridSpan w:val="2"/>
+                  <w:vAlign w:val="center"/>
+                  <w:shd w:val="clear" w:color="auto" w:fill="EEEEEF"/>
+                </w:tcPr>
+                <w:p>
+                  <w:pPr>
+                    <w:spacing w:before="0" w:after="0" w:line="240" w:lineRule="auto"/>
+                  </w:pPr>
+                  <w:r>
+                    <w:rPr>
+                      <w:rFonts w:ascii="Avenir Next" w:hAnsi="Avenir Next"/>
+                      <w:b w:val="0"/>
+                      <w:i w:val="0"/>
+                      <w:sz w:val="17"/>
+                    </w:rPr>
+                  </w:r>
+                </w:p>
+              </w:tc>
+            </w:tr>
           </w:tbl>
           <w:p/>
         </w:tc>

</xml_diff>